<commit_message>
feat: motor de cálculo de notas (6 métodos) + endpoints calculate/calculation-methods + docs/evidências
</commit_message>
<xml_diff>
--- a/docs/G3_Horario_Avaliacoes_Type_Documentacao.docx
+++ b/docs/G3_Horario_Avaliacoes_Type_Documentacao.docx
@@ -1609,6 +1609,336 @@
     <w:p>
       <w:r>
         <w:br w:type="page"/>
+      </w:r>
+    </w:p>
+    <w:p>
+      <w:r>
+        <w:t>O motor de cálculo permite que a universidade configure o método de avaliação conforme as necessidades de cada disciplina, mantendo consistência e auditabilidade. A separação entre domínio (funções puras), validação (Zod) e persistência (Prisma) permite testar cada camada independentemente.</w:t>
+      </w:r>
+    </w:p>
+    <w:p>
+      <w:pPr>
+        <w:pStyle w:val="Heading2"/>
+      </w:pPr>
+      <w:r>
+        <w:t>Conclusão</w:t>
+      </w:r>
+    </w:p>
+    <w:p>
+      <w:r>
+        <w:t>Todos os 121 testes passam (75 unit + 46 e2e). Typecheck limpo. POST /api/v1/results/calculate retorna o resultado correcto com breakdown detalhado (cálculo interno exato, arredondamento aplicado no final).</w:t>
+      </w:r>
+    </w:p>
+    <w:p>
+      <w:pPr>
+        <w:pStyle w:val="Heading2"/>
+      </w:pPr>
+      <w:r>
+        <w:t>Evidência</w:t>
+      </w:r>
+    </w:p>
+    <w:p>
+      <w:r>
+        <w:t>18 testes e2e (calculation.e2e.test.ts) cobrindo: sucesso para todos os métodos, arredondamento, erros 400 (método inválido, lista vazia, nota negativa, peso negativo, sem fórmula, sem componentes, fórmula não registada), 409 (pesos incompatíveis), 404 (assessment inexistente).</w:t>
+      </w:r>
+    </w:p>
+    <w:p>
+      <w:r>
+        <w:t>54 testes unitários (calculationEngine.test.ts) cobrindo: todos os 6 métodos, arredondamento 0/1/2, intervalos de notas, pesos, cálculo por componentes, fórmulas customizadas, erros (EMPTY_ITEMS, INVALID_SCORE, INVALID_WEIGHT, WEIGHT_TOTAL_MISMATCH, FORMULA_NOT_REGISTERED).</w:t>
+      </w:r>
+    </w:p>
+    <w:p>
+      <w:pPr>
+        <w:pStyle w:val="Heading2"/>
+      </w:pPr>
+      <w:r>
+        <w:t>Testes</w:t>
+      </w:r>
+    </w:p>
+    <w:p>
+      <w:r>
+        <w:t>O motor está em domain/calculationEngine.ts. Funções puras (sem efeitos laterais) que recebem CalculationInput e retornam CalculationResult. Registry de fórmulas customizadas (CUSTOM_FORMULAS): SUM, MAX, MIN, WEIGHTED_100, NORMALIZED_MEAN, MEAN_OF_TOP_K. Calcula-se o valor exato, depois arredonda-se no final (roundValue).</w:t>
+      </w:r>
+    </w:p>
+    <w:p>
+      <w:pPr>
+        <w:pStyle w:val="Heading2"/>
+      </w:pPr>
+      <w:r>
+        <w:t>Código — Domínio</w:t>
+      </w:r>
+    </w:p>
+    <w:p>
+      <w:pPr>
+        <w:pStyle w:val="ListBullet"/>
+      </w:pPr>
+      <w:r>
+        <w:t>Lista vazia de itens: 400 VALIDATION_ERROR.</w:t>
+      </w:r>
+    </w:p>
+    <w:p>
+      <w:pPr>
+        <w:pStyle w:val="ListBullet"/>
+      </w:pPr>
+      <w:r>
+        <w:t>Pesos incompatíveis com método: 409 CONFLICT.</w:t>
+      </w:r>
+    </w:p>
+    <w:p>
+      <w:pPr>
+        <w:pStyle w:val="ListBullet"/>
+      </w:pPr>
+      <w:r>
+        <w:t>AssessmentId inexistente: 404 NOT_FOUND.</w:t>
+      </w:r>
+    </w:p>
+    <w:p>
+      <w:pPr>
+        <w:pStyle w:val="ListBullet"/>
+      </w:pPr>
+      <w:r>
+        <w:t>Intervalo de notas: minScore/maxScore configurável (default 0/20).</w:t>
+      </w:r>
+    </w:p>
+    <w:p>
+      <w:pPr>
+        <w:pStyle w:val="ListBullet"/>
+      </w:pPr>
+      <w:r>
+        <w:t>Arredondamento: decimals 0|1|2 (default 2). Cálculo interno exato.</w:t>
+      </w:r>
+    </w:p>
+    <w:p>
+      <w:pPr>
+        <w:pStyle w:val="ListBullet"/>
+      </w:pPr>
+      <w:r>
+        <w:t>CUSTOM_WEIGHTED: requer campo 'formula' com fórmula registada no domínio.</w:t>
+      </w:r>
+    </w:p>
+    <w:p>
+      <w:pPr>
+        <w:pStyle w:val="ListBullet"/>
+      </w:pPr>
+      <w:r>
+        <w:t>COMPONENT_BASED: requer componentes com sub-items; soma dos pesos = 100.</w:t>
+      </w:r>
+    </w:p>
+    <w:p>
+      <w:pPr>
+        <w:pStyle w:val="ListBullet"/>
+      </w:pPr>
+      <w:r>
+        <w:t>PERCENTAGE_SUM: soma dos pesos deve ser exatamente 100.</w:t>
+      </w:r>
+    </w:p>
+    <w:p>
+      <w:pPr>
+        <w:pStyle w:val="ListBullet"/>
+      </w:pPr>
+      <w:r>
+        <w:t>WEIGHTED_PERCENTAGE: soma dos pesos deve igualar expectedTotal (default 100).</w:t>
+      </w:r>
+    </w:p>
+    <w:p>
+      <w:pPr>
+        <w:pStyle w:val="ListBullet"/>
+      </w:pPr>
+      <w:r>
+        <w:t>Pesos: 0–100; obrigatórios para métodos que os utilizam.</w:t>
+      </w:r>
+    </w:p>
+    <w:p>
+      <w:pPr>
+        <w:pStyle w:val="Heading2"/>
+      </w:pPr>
+      <w:r>
+        <w:t>Validação e Regras</w:t>
+      </w:r>
+    </w:p>
+    <w:p>
+      <w:r>
+        <w:t>GET /api/v1/results/calculation-methods — Lista os 6 métodos disponíveis com nome, descrição, campos requeridos e fórmulas suportadas.</w:t>
+      </w:r>
+    </w:p>
+    <w:p>
+      <w:r>
+        <w:t>POST /api/v1/results/calculate — Calcula nota com método flexível (sem persistir). Aceita: method, items[], components?[], formula?, rounding?, minScore?, maxScore?, expectedTotal?. Retorna: { method, value, decimals, breakdown[] }.</w:t>
+      </w:r>
+    </w:p>
+    <w:p>
+      <w:pPr>
+        <w:pStyle w:val="Heading2"/>
+      </w:pPr>
+      <w:r>
+        <w:t>Motor de Cálculo — API</w:t>
+      </w:r>
+    </w:p>
+    <w:p>
+      <w:r>
+        <w:t>Registry controlado sem eval. Cada fórmula é validada no domínio.</w:t>
+      </w:r>
+    </w:p>
+    <w:p>
+      <w:r>
+        <w:t>Exemplo: formula=WEIGHTED_100, pesos [30,70], notas [14,16] → 15.2</w:t>
+      </w:r>
+    </w:p>
+    <w:p>
+      <w:r>
+        <w:t>Fórmulas suportadas: SUM, MAX, MIN, WEIGHTED_100, NORMALIZED_MEAN, MEAN_OF_TOP_K</w:t>
+      </w:r>
+    </w:p>
+    <w:p>
+      <w:pPr>
+        <w:pStyle w:val="Heading3"/>
+      </w:pPr>
+      <w:r>
+        <w:t>CUSTOM_WEIGHTED — Cálculo Personalizado</w:t>
+      </w:r>
+    </w:p>
+    <w:p>
+      <w:r>
+        <w:t>Modela a estrutura real universitária: componentes com sub-avaliações.</w:t>
+      </w:r>
+    </w:p>
+    <w:p>
+      <w:r>
+        <w:t>Exemplo: AC(peso=40) = média(teste1,teste2) = 15.0; Exame(peso=60) = 17; Final = 16.2</w:t>
+      </w:r>
+    </w:p>
+    <w:p>
+      <w:r>
+        <w:t>Fórmula: Para cada componente → weightedAverage(sub-notas); resultado = Σ(componente_media × componente_peso)</w:t>
+      </w:r>
+    </w:p>
+    <w:p>
+      <w:pPr>
+        <w:pStyle w:val="Heading3"/>
+      </w:pPr>
+      <w:r>
+        <w:t>COMPONENT_BASED — Média por Componentes</w:t>
+      </w:r>
+    </w:p>
+    <w:p>
+      <w:r>
+        <w:t>Normaliza automaticamente os pesos. Útil quando os pesos não totalizam 100.</w:t>
+      </w:r>
+    </w:p>
+    <w:p>
+      <w:r>
+        <w:t>Exemplo: pesos [30,70] → normalizados [0.3,0.7]; notas [14,16] → 15.4</w:t>
+      </w:r>
+    </w:p>
+    <w:p>
+      <w:r>
+        <w:t>Fórmula: peso_normalizado = peso/Σ(pesos); Σ(nota × peso_normalizado)</w:t>
+      </w:r>
+    </w:p>
+    <w:p>
+      <w:pPr>
+        <w:pStyle w:val="Heading3"/>
+      </w:pPr>
+      <w:r>
+        <w:t>NORMALIZED_WEIGHTED_MEAN — Média Ponderada Normalizada</w:t>
+      </w:r>
+    </w:p>
+    <w:p>
+      <w:r>
+        <w:t>Pesos representam percentagens e devem totalizar exatamente 100.</w:t>
+      </w:r>
+    </w:p>
+    <w:p>
+      <w:r>
+        <w:t>Exemplo: AC=14 (peso=40%), Exame=16 (peso=60%) → Contribuição = 15.2</w:t>
+      </w:r>
+    </w:p>
+    <w:p>
+      <w:r>
+        <w:t>Fórmula: Σ(nota × peso/100)</w:t>
+      </w:r>
+    </w:p>
+    <w:p>
+      <w:pPr>
+        <w:pStyle w:val="Heading3"/>
+      </w:pPr>
+      <w:r>
+        <w:t>PERCENTAGE_SUM — Soma de Percentagens Ponderadas</w:t>
+      </w:r>
+    </w:p>
+    <w:p>
+      <w:r>
+        <w:t>O método mais utilizado no ensino superior. Os pesos devem totalizar 100.</w:t>
+      </w:r>
+    </w:p>
+    <w:p>
+      <w:r>
+        <w:t>Exemplo: Teste=14 (peso=30), Exame=16 (peso=70) → NotaFinal = 15.4</w:t>
+      </w:r>
+    </w:p>
+    <w:p>
+      <w:r>
+        <w:t>Fórmula: Σ(nota × peso) / Σ(pesos)</w:t>
+      </w:r>
+    </w:p>
+    <w:p>
+      <w:pPr>
+        <w:pStyle w:val="Heading3"/>
+      </w:pPr>
+      <w:r>
+        <w:t>WEIGHTED_PERCENTAGE — Média Ponderada (método padrão)</w:t>
+      </w:r>
+    </w:p>
+    <w:p>
+      <w:r>
+        <w:t>Útil quando todas as avaliações têm o mesmo peso académico.</w:t>
+      </w:r>
+    </w:p>
+    <w:p>
+      <w:r>
+        <w:t>Exemplo: Teste1=13, Teste2=15, Teste3=14 → Média = 14</w:t>
+      </w:r>
+    </w:p>
+    <w:p>
+      <w:r>
+        <w:t>Fórmula: (N1 + N2 + ... + Nn) / n</w:t>
+      </w:r>
+    </w:p>
+    <w:p>
+      <w:pPr>
+        <w:pStyle w:val="Heading3"/>
+      </w:pPr>
+      <w:r>
+        <w:t>ARITHMETIC_MEAN — Média Aritmética</w:t>
+      </w:r>
+    </w:p>
+    <w:p>
+      <w:pPr>
+        <w:pStyle w:val="Heading2"/>
+      </w:pPr>
+      <w:r>
+        <w:t>Métodos de Cálculo</w:t>
+      </w:r>
+    </w:p>
+    <w:p>
+      <w:r>
+        <w:t>Implementar um motor de cálculo de notas académicas flexível, suportando 6 métodos configuráveis (média aritmética, média ponderada, soma percentual, média ponderada normalizada, média por componentes e cálculo personalizado), com arredondamento configurável e validação rigorosa de pesos e intervalos de notas.</w:t>
+      </w:r>
+    </w:p>
+    <w:p>
+      <w:pPr>
+        <w:pStyle w:val="Heading2"/>
+      </w:pPr>
+      <w:r>
+        <w:t>Objectivo</w:t>
+      </w:r>
+    </w:p>
+    <w:p>
+      <w:pPr>
+        <w:pStyle w:val="Heading1"/>
+      </w:pPr>
+      <w:r>
+        <w:t>Exercicio 8 — Motor de Cálculo de Notas</w:t>
       </w:r>
     </w:p>
     <w:p>

</xml_diff>